<commit_message>
Project form: real Word checkboxes instead of glyphs
Ed opened the form in Word and asked for tick boxes he can click. The
generator now emits w14:checkbox content controls (docx 9.7.1 CheckBox)
in place of the U+2610 glyph: 18 controls across type of work, sector,
client naming, status and the three sign-off rows, all unchecked. Schema
validation passes; no stray glyphs; no dashes.

Co-Authored-By: Claude Fable 5.1 <noreply@anthropic.com>
Claude-Session: https://claude.ai/code/session_01FxUb21i6wuqWYUenUkor3q
</commit_message>
<xml_diff>
--- a/tasks/Surrey-Contracting-project-case-study-form.docx
+++ b/tasks/Surrey-Contracting-project-case-study-form.docx
@@ -240,13 +240,117 @@
             <w:pPr>
               <w:spacing w:after="120"/>
             </w:pPr>
-            <w:r>
-              <w:rPr>
-                <w:rFonts w:ascii="Arial" w:cs="Arial" w:eastAsia="Arial" w:hAnsi="Arial"/>
-                <w:sz w:val="21"/>
-                <w:szCs w:val="21"/>
-              </w:rPr>
-              <w:t xml:space="preserve">☐ Groundworks     ☐ Earthworks     ☐ Demolition     ☐ Drainage</w:t>
+            <w:sdt>
+              <w:sdtPr>
+                <w14:checkbox>
+                  <w14:checked w14:val="0"/>
+                  <w14:checkedState w14:val="2612" w14:font="MS Gothic"/>
+                  <w14:uncheckedState w14:val="2610" w14:font="MS Gothic"/>
+                </w14:checkbox>
+              </w:sdtPr>
+              <w:sdtContent>
+                <w:r>
+                  <w:sym w:char="2610" w:font="MS Gothic"/>
+                </w:r>
+              </w:sdtContent>
+            </w:sdt>
+            <w:r>
+              <w:rPr>
+                <w:rFonts w:ascii="Arial" w:cs="Arial" w:eastAsia="Arial" w:hAnsi="Arial"/>
+                <w:sz w:val="21"/>
+                <w:szCs w:val="21"/>
+              </w:rPr>
+              <w:t xml:space="preserve"> Groundworks</w:t>
+            </w:r>
+            <w:r>
+              <w:rPr>
+                <w:rFonts w:ascii="Arial" w:cs="Arial" w:eastAsia="Arial" w:hAnsi="Arial"/>
+                <w:sz w:val="21"/>
+                <w:szCs w:val="21"/>
+              </w:rPr>
+              <w:t xml:space="preserve">      </w:t>
+            </w:r>
+            <w:sdt>
+              <w:sdtPr>
+                <w14:checkbox>
+                  <w14:checked w14:val="0"/>
+                  <w14:checkedState w14:val="2612" w14:font="MS Gothic"/>
+                  <w14:uncheckedState w14:val="2610" w14:font="MS Gothic"/>
+                </w14:checkbox>
+              </w:sdtPr>
+              <w:sdtContent>
+                <w:r>
+                  <w:sym w:char="2610" w:font="MS Gothic"/>
+                </w:r>
+              </w:sdtContent>
+            </w:sdt>
+            <w:r>
+              <w:rPr>
+                <w:rFonts w:ascii="Arial" w:cs="Arial" w:eastAsia="Arial" w:hAnsi="Arial"/>
+                <w:sz w:val="21"/>
+                <w:szCs w:val="21"/>
+              </w:rPr>
+              <w:t xml:space="preserve"> Earthworks</w:t>
+            </w:r>
+            <w:r>
+              <w:rPr>
+                <w:rFonts w:ascii="Arial" w:cs="Arial" w:eastAsia="Arial" w:hAnsi="Arial"/>
+                <w:sz w:val="21"/>
+                <w:szCs w:val="21"/>
+              </w:rPr>
+              <w:t xml:space="preserve">      </w:t>
+            </w:r>
+            <w:sdt>
+              <w:sdtPr>
+                <w14:checkbox>
+                  <w14:checked w14:val="0"/>
+                  <w14:checkedState w14:val="2612" w14:font="MS Gothic"/>
+                  <w14:uncheckedState w14:val="2610" w14:font="MS Gothic"/>
+                </w14:checkbox>
+              </w:sdtPr>
+              <w:sdtContent>
+                <w:r>
+                  <w:sym w:char="2610" w:font="MS Gothic"/>
+                </w:r>
+              </w:sdtContent>
+            </w:sdt>
+            <w:r>
+              <w:rPr>
+                <w:rFonts w:ascii="Arial" w:cs="Arial" w:eastAsia="Arial" w:hAnsi="Arial"/>
+                <w:sz w:val="21"/>
+                <w:szCs w:val="21"/>
+              </w:rPr>
+              <w:t xml:space="preserve"> Demolition</w:t>
+            </w:r>
+            <w:r>
+              <w:rPr>
+                <w:rFonts w:ascii="Arial" w:cs="Arial" w:eastAsia="Arial" w:hAnsi="Arial"/>
+                <w:sz w:val="21"/>
+                <w:szCs w:val="21"/>
+              </w:rPr>
+              <w:t xml:space="preserve">      </w:t>
+            </w:r>
+            <w:sdt>
+              <w:sdtPr>
+                <w14:checkbox>
+                  <w14:checked w14:val="0"/>
+                  <w14:checkedState w14:val="2612" w14:font="MS Gothic"/>
+                  <w14:uncheckedState w14:val="2610" w14:font="MS Gothic"/>
+                </w14:checkbox>
+              </w:sdtPr>
+              <w:sdtContent>
+                <w:r>
+                  <w:sym w:char="2610" w:font="MS Gothic"/>
+                </w:r>
+              </w:sdtContent>
+            </w:sdt>
+            <w:r>
+              <w:rPr>
+                <w:rFonts w:ascii="Arial" w:cs="Arial" w:eastAsia="Arial" w:hAnsi="Arial"/>
+                <w:sz w:val="21"/>
+                <w:szCs w:val="21"/>
+              </w:rPr>
+              <w:t xml:space="preserve"> Drainage</w:t>
             </w:r>
           </w:p>
         </w:tc>
@@ -321,13 +425,117 @@
             <w:pPr>
               <w:spacing w:after="120"/>
             </w:pPr>
-            <w:r>
-              <w:rPr>
-                <w:rFonts w:ascii="Arial" w:cs="Arial" w:eastAsia="Arial" w:hAnsi="Arial"/>
-                <w:sz w:val="21"/>
-                <w:szCs w:val="21"/>
-              </w:rPr>
-              <w:t xml:space="preserve">☐ Residential     ☐ Commercial     ☐ Education     ☐ Public sector</w:t>
+            <w:sdt>
+              <w:sdtPr>
+                <w14:checkbox>
+                  <w14:checked w14:val="0"/>
+                  <w14:checkedState w14:val="2612" w14:font="MS Gothic"/>
+                  <w14:uncheckedState w14:val="2610" w14:font="MS Gothic"/>
+                </w14:checkbox>
+              </w:sdtPr>
+              <w:sdtContent>
+                <w:r>
+                  <w:sym w:char="2610" w:font="MS Gothic"/>
+                </w:r>
+              </w:sdtContent>
+            </w:sdt>
+            <w:r>
+              <w:rPr>
+                <w:rFonts w:ascii="Arial" w:cs="Arial" w:eastAsia="Arial" w:hAnsi="Arial"/>
+                <w:sz w:val="21"/>
+                <w:szCs w:val="21"/>
+              </w:rPr>
+              <w:t xml:space="preserve"> Residential</w:t>
+            </w:r>
+            <w:r>
+              <w:rPr>
+                <w:rFonts w:ascii="Arial" w:cs="Arial" w:eastAsia="Arial" w:hAnsi="Arial"/>
+                <w:sz w:val="21"/>
+                <w:szCs w:val="21"/>
+              </w:rPr>
+              <w:t xml:space="preserve">      </w:t>
+            </w:r>
+            <w:sdt>
+              <w:sdtPr>
+                <w14:checkbox>
+                  <w14:checked w14:val="0"/>
+                  <w14:checkedState w14:val="2612" w14:font="MS Gothic"/>
+                  <w14:uncheckedState w14:val="2610" w14:font="MS Gothic"/>
+                </w14:checkbox>
+              </w:sdtPr>
+              <w:sdtContent>
+                <w:r>
+                  <w:sym w:char="2610" w:font="MS Gothic"/>
+                </w:r>
+              </w:sdtContent>
+            </w:sdt>
+            <w:r>
+              <w:rPr>
+                <w:rFonts w:ascii="Arial" w:cs="Arial" w:eastAsia="Arial" w:hAnsi="Arial"/>
+                <w:sz w:val="21"/>
+                <w:szCs w:val="21"/>
+              </w:rPr>
+              <w:t xml:space="preserve"> Commercial</w:t>
+            </w:r>
+            <w:r>
+              <w:rPr>
+                <w:rFonts w:ascii="Arial" w:cs="Arial" w:eastAsia="Arial" w:hAnsi="Arial"/>
+                <w:sz w:val="21"/>
+                <w:szCs w:val="21"/>
+              </w:rPr>
+              <w:t xml:space="preserve">      </w:t>
+            </w:r>
+            <w:sdt>
+              <w:sdtPr>
+                <w14:checkbox>
+                  <w14:checked w14:val="0"/>
+                  <w14:checkedState w14:val="2612" w14:font="MS Gothic"/>
+                  <w14:uncheckedState w14:val="2610" w14:font="MS Gothic"/>
+                </w14:checkbox>
+              </w:sdtPr>
+              <w:sdtContent>
+                <w:r>
+                  <w:sym w:char="2610" w:font="MS Gothic"/>
+                </w:r>
+              </w:sdtContent>
+            </w:sdt>
+            <w:r>
+              <w:rPr>
+                <w:rFonts w:ascii="Arial" w:cs="Arial" w:eastAsia="Arial" w:hAnsi="Arial"/>
+                <w:sz w:val="21"/>
+                <w:szCs w:val="21"/>
+              </w:rPr>
+              <w:t xml:space="preserve"> Education</w:t>
+            </w:r>
+            <w:r>
+              <w:rPr>
+                <w:rFonts w:ascii="Arial" w:cs="Arial" w:eastAsia="Arial" w:hAnsi="Arial"/>
+                <w:sz w:val="21"/>
+                <w:szCs w:val="21"/>
+              </w:rPr>
+              <w:t xml:space="preserve">      </w:t>
+            </w:r>
+            <w:sdt>
+              <w:sdtPr>
+                <w14:checkbox>
+                  <w14:checked w14:val="0"/>
+                  <w14:checkedState w14:val="2612" w14:font="MS Gothic"/>
+                  <w14:uncheckedState w14:val="2610" w14:font="MS Gothic"/>
+                </w14:checkbox>
+              </w:sdtPr>
+              <w:sdtContent>
+                <w:r>
+                  <w:sym w:char="2610" w:font="MS Gothic"/>
+                </w:r>
+              </w:sdtContent>
+            </w:sdt>
+            <w:r>
+              <w:rPr>
+                <w:rFonts w:ascii="Arial" w:cs="Arial" w:eastAsia="Arial" w:hAnsi="Arial"/>
+                <w:sz w:val="21"/>
+                <w:szCs w:val="21"/>
+              </w:rPr>
+              <w:t xml:space="preserve"> Public sector</w:t>
             </w:r>
           </w:p>
         </w:tc>
@@ -467,13 +675,87 @@
             <w:pPr>
               <w:spacing w:after="120"/>
             </w:pPr>
-            <w:r>
-              <w:rPr>
-                <w:rFonts w:ascii="Arial" w:cs="Arial" w:eastAsia="Arial" w:hAnsi="Arial"/>
-                <w:sz w:val="21"/>
-                <w:szCs w:val="21"/>
-              </w:rPr>
-              <w:t xml:space="preserve">☐ Yes     ☐ No     ☐ Ask them first</w:t>
+            <w:sdt>
+              <w:sdtPr>
+                <w14:checkbox>
+                  <w14:checked w14:val="0"/>
+                  <w14:checkedState w14:val="2612" w14:font="MS Gothic"/>
+                  <w14:uncheckedState w14:val="2610" w14:font="MS Gothic"/>
+                </w14:checkbox>
+              </w:sdtPr>
+              <w:sdtContent>
+                <w:r>
+                  <w:sym w:char="2610" w:font="MS Gothic"/>
+                </w:r>
+              </w:sdtContent>
+            </w:sdt>
+            <w:r>
+              <w:rPr>
+                <w:rFonts w:ascii="Arial" w:cs="Arial" w:eastAsia="Arial" w:hAnsi="Arial"/>
+                <w:sz w:val="21"/>
+                <w:szCs w:val="21"/>
+              </w:rPr>
+              <w:t xml:space="preserve"> Yes</w:t>
+            </w:r>
+            <w:r>
+              <w:rPr>
+                <w:rFonts w:ascii="Arial" w:cs="Arial" w:eastAsia="Arial" w:hAnsi="Arial"/>
+                <w:sz w:val="21"/>
+                <w:szCs w:val="21"/>
+              </w:rPr>
+              <w:t xml:space="preserve">      </w:t>
+            </w:r>
+            <w:sdt>
+              <w:sdtPr>
+                <w14:checkbox>
+                  <w14:checked w14:val="0"/>
+                  <w14:checkedState w14:val="2612" w14:font="MS Gothic"/>
+                  <w14:uncheckedState w14:val="2610" w14:font="MS Gothic"/>
+                </w14:checkbox>
+              </w:sdtPr>
+              <w:sdtContent>
+                <w:r>
+                  <w:sym w:char="2610" w:font="MS Gothic"/>
+                </w:r>
+              </w:sdtContent>
+            </w:sdt>
+            <w:r>
+              <w:rPr>
+                <w:rFonts w:ascii="Arial" w:cs="Arial" w:eastAsia="Arial" w:hAnsi="Arial"/>
+                <w:sz w:val="21"/>
+                <w:szCs w:val="21"/>
+              </w:rPr>
+              <w:t xml:space="preserve"> No</w:t>
+            </w:r>
+            <w:r>
+              <w:rPr>
+                <w:rFonts w:ascii="Arial" w:cs="Arial" w:eastAsia="Arial" w:hAnsi="Arial"/>
+                <w:sz w:val="21"/>
+                <w:szCs w:val="21"/>
+              </w:rPr>
+              <w:t xml:space="preserve">      </w:t>
+            </w:r>
+            <w:sdt>
+              <w:sdtPr>
+                <w14:checkbox>
+                  <w14:checked w14:val="0"/>
+                  <w14:checkedState w14:val="2612" w14:font="MS Gothic"/>
+                  <w14:uncheckedState w14:val="2610" w14:font="MS Gothic"/>
+                </w14:checkbox>
+              </w:sdtPr>
+              <w:sdtContent>
+                <w:r>
+                  <w:sym w:char="2610" w:font="MS Gothic"/>
+                </w:r>
+              </w:sdtContent>
+            </w:sdt>
+            <w:r>
+              <w:rPr>
+                <w:rFonts w:ascii="Arial" w:cs="Arial" w:eastAsia="Arial" w:hAnsi="Arial"/>
+                <w:sz w:val="21"/>
+                <w:szCs w:val="21"/>
+              </w:rPr>
+              <w:t xml:space="preserve"> Ask them first</w:t>
             </w:r>
           </w:p>
         </w:tc>
@@ -840,13 +1122,57 @@
             <w:pPr>
               <w:spacing w:after="120"/>
             </w:pPr>
-            <w:r>
-              <w:rPr>
-                <w:rFonts w:ascii="Arial" w:cs="Arial" w:eastAsia="Arial" w:hAnsi="Arial"/>
-                <w:sz w:val="21"/>
-                <w:szCs w:val="21"/>
-              </w:rPr>
-              <w:t xml:space="preserve">☐ Completed     ☐ In progress</w:t>
+            <w:sdt>
+              <w:sdtPr>
+                <w14:checkbox>
+                  <w14:checked w14:val="0"/>
+                  <w14:checkedState w14:val="2612" w14:font="MS Gothic"/>
+                  <w14:uncheckedState w14:val="2610" w14:font="MS Gothic"/>
+                </w14:checkbox>
+              </w:sdtPr>
+              <w:sdtContent>
+                <w:r>
+                  <w:sym w:char="2610" w:font="MS Gothic"/>
+                </w:r>
+              </w:sdtContent>
+            </w:sdt>
+            <w:r>
+              <w:rPr>
+                <w:rFonts w:ascii="Arial" w:cs="Arial" w:eastAsia="Arial" w:hAnsi="Arial"/>
+                <w:sz w:val="21"/>
+                <w:szCs w:val="21"/>
+              </w:rPr>
+              <w:t xml:space="preserve"> Completed</w:t>
+            </w:r>
+            <w:r>
+              <w:rPr>
+                <w:rFonts w:ascii="Arial" w:cs="Arial" w:eastAsia="Arial" w:hAnsi="Arial"/>
+                <w:sz w:val="21"/>
+                <w:szCs w:val="21"/>
+              </w:rPr>
+              <w:t xml:space="preserve">      </w:t>
+            </w:r>
+            <w:sdt>
+              <w:sdtPr>
+                <w14:checkbox>
+                  <w14:checked w14:val="0"/>
+                  <w14:checkedState w14:val="2612" w14:font="MS Gothic"/>
+                  <w14:uncheckedState w14:val="2610" w14:font="MS Gothic"/>
+                </w14:checkbox>
+              </w:sdtPr>
+              <w:sdtContent>
+                <w:r>
+                  <w:sym w:char="2610" w:font="MS Gothic"/>
+                </w:r>
+              </w:sdtContent>
+            </w:sdt>
+            <w:r>
+              <w:rPr>
+                <w:rFonts w:ascii="Arial" w:cs="Arial" w:eastAsia="Arial" w:hAnsi="Arial"/>
+                <w:sz w:val="21"/>
+                <w:szCs w:val="21"/>
+              </w:rPr>
+              <w:t xml:space="preserve"> In progress</w:t>
             </w:r>
           </w:p>
         </w:tc>
@@ -1577,13 +1903,27 @@
             <w:pPr>
               <w:spacing w:after="120"/>
             </w:pPr>
-            <w:r>
-              <w:rPr>
-                <w:rFonts w:ascii="Arial" w:cs="Arial" w:eastAsia="Arial" w:hAnsi="Arial"/>
-                <w:sz w:val="21"/>
-                <w:szCs w:val="21"/>
-              </w:rPr>
-              <w:t xml:space="preserve">☐ Yes</w:t>
+            <w:sdt>
+              <w:sdtPr>
+                <w14:checkbox>
+                  <w14:checked w14:val="0"/>
+                  <w14:checkedState w14:val="2612" w14:font="MS Gothic"/>
+                  <w14:uncheckedState w14:val="2610" w14:font="MS Gothic"/>
+                </w14:checkbox>
+              </w:sdtPr>
+              <w:sdtContent>
+                <w:r>
+                  <w:sym w:char="2610" w:font="MS Gothic"/>
+                </w:r>
+              </w:sdtContent>
+            </w:sdt>
+            <w:r>
+              <w:rPr>
+                <w:rFonts w:ascii="Arial" w:cs="Arial" w:eastAsia="Arial" w:hAnsi="Arial"/>
+                <w:sz w:val="21"/>
+                <w:szCs w:val="21"/>
+              </w:rPr>
+              <w:t xml:space="preserve"> Yes</w:t>
             </w:r>
           </w:p>
         </w:tc>
@@ -1642,13 +1982,87 @@
             <w:pPr>
               <w:spacing w:after="120"/>
             </w:pPr>
-            <w:r>
-              <w:rPr>
-                <w:rFonts w:ascii="Arial" w:cs="Arial" w:eastAsia="Arial" w:hAnsi="Arial"/>
-                <w:sz w:val="21"/>
-                <w:szCs w:val="21"/>
-              </w:rPr>
-              <w:t xml:space="preserve">☐ Have it     ☐ Not naming them     ☐ Will ask</w:t>
+            <w:sdt>
+              <w:sdtPr>
+                <w14:checkbox>
+                  <w14:checked w14:val="0"/>
+                  <w14:checkedState w14:val="2612" w14:font="MS Gothic"/>
+                  <w14:uncheckedState w14:val="2610" w14:font="MS Gothic"/>
+                </w14:checkbox>
+              </w:sdtPr>
+              <w:sdtContent>
+                <w:r>
+                  <w:sym w:char="2610" w:font="MS Gothic"/>
+                </w:r>
+              </w:sdtContent>
+            </w:sdt>
+            <w:r>
+              <w:rPr>
+                <w:rFonts w:ascii="Arial" w:cs="Arial" w:eastAsia="Arial" w:hAnsi="Arial"/>
+                <w:sz w:val="21"/>
+                <w:szCs w:val="21"/>
+              </w:rPr>
+              <w:t xml:space="preserve"> Have it</w:t>
+            </w:r>
+            <w:r>
+              <w:rPr>
+                <w:rFonts w:ascii="Arial" w:cs="Arial" w:eastAsia="Arial" w:hAnsi="Arial"/>
+                <w:sz w:val="21"/>
+                <w:szCs w:val="21"/>
+              </w:rPr>
+              <w:t xml:space="preserve">      </w:t>
+            </w:r>
+            <w:sdt>
+              <w:sdtPr>
+                <w14:checkbox>
+                  <w14:checked w14:val="0"/>
+                  <w14:checkedState w14:val="2612" w14:font="MS Gothic"/>
+                  <w14:uncheckedState w14:val="2610" w14:font="MS Gothic"/>
+                </w14:checkbox>
+              </w:sdtPr>
+              <w:sdtContent>
+                <w:r>
+                  <w:sym w:char="2610" w:font="MS Gothic"/>
+                </w:r>
+              </w:sdtContent>
+            </w:sdt>
+            <w:r>
+              <w:rPr>
+                <w:rFonts w:ascii="Arial" w:cs="Arial" w:eastAsia="Arial" w:hAnsi="Arial"/>
+                <w:sz w:val="21"/>
+                <w:szCs w:val="21"/>
+              </w:rPr>
+              <w:t xml:space="preserve"> Not naming them</w:t>
+            </w:r>
+            <w:r>
+              <w:rPr>
+                <w:rFonts w:ascii="Arial" w:cs="Arial" w:eastAsia="Arial" w:hAnsi="Arial"/>
+                <w:sz w:val="21"/>
+                <w:szCs w:val="21"/>
+              </w:rPr>
+              <w:t xml:space="preserve">      </w:t>
+            </w:r>
+            <w:sdt>
+              <w:sdtPr>
+                <w14:checkbox>
+                  <w14:checked w14:val="0"/>
+                  <w14:checkedState w14:val="2612" w14:font="MS Gothic"/>
+                  <w14:uncheckedState w14:val="2610" w14:font="MS Gothic"/>
+                </w14:checkbox>
+              </w:sdtPr>
+              <w:sdtContent>
+                <w:r>
+                  <w:sym w:char="2610" w:font="MS Gothic"/>
+                </w:r>
+              </w:sdtContent>
+            </w:sdt>
+            <w:r>
+              <w:rPr>
+                <w:rFonts w:ascii="Arial" w:cs="Arial" w:eastAsia="Arial" w:hAnsi="Arial"/>
+                <w:sz w:val="21"/>
+                <w:szCs w:val="21"/>
+              </w:rPr>
+              <w:t xml:space="preserve"> Will ask</w:t>
             </w:r>
           </w:p>
         </w:tc>
@@ -1723,13 +2137,27 @@
             <w:pPr>
               <w:spacing w:after="120"/>
             </w:pPr>
-            <w:r>
-              <w:rPr>
-                <w:rFonts w:ascii="Arial" w:cs="Arial" w:eastAsia="Arial" w:hAnsi="Arial"/>
-                <w:sz w:val="21"/>
-                <w:szCs w:val="21"/>
-              </w:rPr>
-              <w:t xml:space="preserve">☐ Confirmed</w:t>
+            <w:sdt>
+              <w:sdtPr>
+                <w14:checkbox>
+                  <w14:checked w14:val="0"/>
+                  <w14:checkedState w14:val="2612" w14:font="MS Gothic"/>
+                  <w14:uncheckedState w14:val="2610" w14:font="MS Gothic"/>
+                </w14:checkbox>
+              </w:sdtPr>
+              <w:sdtContent>
+                <w:r>
+                  <w:sym w:char="2610" w:font="MS Gothic"/>
+                </w:r>
+              </w:sdtContent>
+            </w:sdt>
+            <w:r>
+              <w:rPr>
+                <w:rFonts w:ascii="Arial" w:cs="Arial" w:eastAsia="Arial" w:hAnsi="Arial"/>
+                <w:sz w:val="21"/>
+                <w:szCs w:val="21"/>
+              </w:rPr>
+              <w:t xml:space="preserve"> Confirmed</w:t>
             </w:r>
           </w:p>
         </w:tc>

</xml_diff>